<commit_message>
Update lab 2 report
</commit_message>
<xml_diff>
--- a/lab-2/Отчет_практическая_работа_2.docx
+++ b/lab-2/Отчет_практическая_работа_2.docx
@@ -121,11 +121,7 @@
         </w:rPr>
       </w:pPr>
       <w:r>
-        <w:t>Кафедра информационных технологий,</w:t>
-      </w:r>
-      <w:r>
-        <w:br/>
-        <w:t>радиотехники и связи</w:t>
+        <w:t>Кафедра информационно-вычислительных систем</w:t>
       </w:r>
     </w:p>
     <w:p>
@@ -428,7 +424,7 @@
           <w:rFonts w:eastAsia="Times New Roman"/>
           <w:color w:val="000000"/>
         </w:rPr>
-        <w:t>ИНФ</w:t>
+        <w:t>ИВС</w:t>
       </w:r>
       <w:r>
         <w:rPr>
@@ -925,8 +921,14 @@
             <w:pPr>
               <w:pStyle w:val="11"/>
               <w:jc w:val="center"/>
+              <w:rPr>
+                <w:lang w:val="ru-RU"/>
+              </w:rPr>
             </w:pPr>
             <w:r>
+              <w:rPr>
+                <w:lang w:val="ru-RU"/>
+              </w:rPr>
               <w:t>Общий объем перехваченных пакетов, байт</w:t>
             </w:r>
           </w:p>
@@ -1449,6 +1451,7 @@
       <w:r>
         <w:rPr>
           <w:noProof/>
+          <w:lang w:eastAsia="ru-RU"/>
         </w:rPr>
         <w:drawing>
           <wp:inline distT="0" distB="0" distL="0" distR="0">
@@ -4098,7 +4101,7 @@
   <a:extraClrSchemeLst/>
   <a:extLst>
     <a:ext uri="{05A4C25C-085E-4340-85A3-A5531E510DB2}">
-      <thm15:themeFamily xmlns="" xmlns:thm15="http://schemas.microsoft.com/office/thememl/2012/main" name="Office Theme" id="{62F939B6-93AF-4DB8-9C6B-D6C7DFDC589F}" vid="{4A3C46E8-61CC-4603-A589-7422A47A8E4A}"/>
+      <thm15:themeFamily xmlns:thm15="http://schemas.microsoft.com/office/thememl/2012/main" xmlns="" name="Office Theme" id="{62F939B6-93AF-4DB8-9C6B-D6C7DFDC589F}" vid="{4A3C46E8-61CC-4603-A589-7422A47A8E4A}"/>
     </a:ext>
   </a:extLst>
 </a:theme>
@@ -4109,7 +4112,7 @@
 </file>
 
 <file path=customXml/itemProps1.xml><?xml version="1.0" encoding="utf-8"?>
-<ds:datastoreItem xmlns:ds="http://schemas.openxmlformats.org/officeDocument/2006/customXml" ds:itemID="{457538D0-FC05-4753-8B78-5B53F11E168F}">
+<ds:datastoreItem xmlns:ds="http://schemas.openxmlformats.org/officeDocument/2006/customXml" ds:itemID="{7F46FB47-8EE6-4527-B6EC-F33ED725A15E}">
   <ds:schemaRefs>
     <ds:schemaRef ds:uri="http://schemas.openxmlformats.org/officeDocument/2006/bibliography"/>
   </ds:schemaRefs>

</xml_diff>